<commit_message>
chore(srs): finalize controlled v1.5 build chain
</commit_message>
<xml_diff>
--- a/output/doc/软件需求规格说明书-信息学院学生综合服务与党团管理平台-v1.5-emf-inkscape.docx
+++ b/output/doc/软件需求规格说明书-信息学院学生综合服务与党团管理平台-v1.5-emf-inkscape.docx
@@ -384,67 +384,59 @@
             <w:vAlign w:val="center"/>
           </w:tcPr>
           <w:p>
-            <w:pPr>
+            <w:r>
+              <w:t>2026-04-14</w:t>
+            </w:r>
+          </w:p>
+        </w:tc>
+        <w:tc>
+          <w:tcPr>
+            <w:tcW w:w="1281" w:type="dxa"/>
+            <w:vAlign w:val="center"/>
+          </w:tcPr>
+          <w:p>
+            <w:r>
+              <w:t>项目组</w:t>
+            </w:r>
+          </w:p>
+        </w:tc>
+        <w:tc>
+          <w:tcPr>
+            <w:tcW w:w="3827" w:type="dxa"/>
+            <w:vAlign w:val="center"/>
+          </w:tcPr>
+          <w:p>
+            <w:r>
+              <w:t>融合需求文档、需求补充、</w:t>
+            </w:r>
+            <w:r>
+              <w:t xml:space="preserve">SRS </w:t>
+            </w:r>
+            <w:r>
+              <w:t>分析资料</w:t>
+            </w:r>
+            <w:r>
               <w:rPr>
                 <w:rFonts w:hint="eastAsia"/>
               </w:rPr>
-            </w:pPr>
-            <w:r>
-              <w:t>2026-0</w:t>
+              <w:t>形成初版软件需求规格说明书。</w:t>
+            </w:r>
+          </w:p>
+        </w:tc>
+        <w:tc>
+          <w:tcPr>
+            <w:tcW w:w="1192" w:type="dxa"/>
+            <w:vAlign w:val="center"/>
+          </w:tcPr>
+          <w:p>
+            <w:r>
+              <w:t>V1.</w:t>
             </w:r>
             <w:r>
               <w:rPr>
                 <w:rFonts w:hint="eastAsia"/>
               </w:rPr>
-              <w:t>3</w:t>
-            </w:r>
-            <w:r>
-              <w:t>-</w:t>
-            </w:r>
-            <w:r>
-              <w:rPr>
-                <w:rFonts w:hint="eastAsia"/>
-              </w:rPr>
-              <w:t>30</w:t>
-            </w:r>
-          </w:p>
-        </w:tc>
-        <w:tc>
-          <w:tcPr>
-            <w:tcW w:w="1281" w:type="dxa"/>
-            <w:vAlign w:val="center"/>
-          </w:tcPr>
-          <w:p>
-            <w:r>
-              <w:t>项目组</w:t>
-            </w:r>
-          </w:p>
-        </w:tc>
-        <w:tc>
-          <w:tcPr>
-            <w:tcW w:w="3827" w:type="dxa"/>
-            <w:vAlign w:val="center"/>
-          </w:tcPr>
-          <w:p>
-            <w:r>
-              <w:t>融合需求文档、需求补充、</w:t>
-            </w:r>
-            <w:r>
-              <w:t xml:space="preserve">SRS </w:t>
-            </w:r>
-            <w:r>
-              <w:t>分析资料形成初版软件需求规格说明书。</w:t>
-            </w:r>
-          </w:p>
-        </w:tc>
-        <w:tc>
-          <w:tcPr>
-            <w:tcW w:w="1192" w:type="dxa"/>
-            <w:vAlign w:val="center"/>
-          </w:tcPr>
-          <w:p>
-            <w:r>
-              <w:t>V1.0</w:t>
+              <w:t>0</w:t>
             </w:r>
           </w:p>
         </w:tc>
@@ -471,19 +463,8 @@
             <w:vAlign w:val="center"/>
           </w:tcPr>
           <w:p>
-            <w:pPr>
-              <w:rPr>
-                <w:rFonts w:hint="eastAsia"/>
-              </w:rPr>
-            </w:pPr>
-            <w:r>
-              <w:t>2026-04-</w:t>
-            </w:r>
-            <w:r>
-              <w:rPr>
-                <w:rFonts w:hint="eastAsia"/>
-              </w:rPr>
-              <w:t>02</w:t>
+            <w:r>
+              <w:t>2026-04-15</w:t>
             </w:r>
           </w:p>
         </w:tc>
@@ -505,13 +486,19 @@
           </w:tcPr>
           <w:p>
             <w:r>
-              <w:t>融合需求文档、需求补充、</w:t>
-            </w:r>
-            <w:r>
-              <w:t xml:space="preserve">SRS </w:t>
-            </w:r>
-            <w:r>
-              <w:t>分析资料和两版现有规格说明书后的增强版需求规格说明书。</w:t>
+              <w:t>根据</w:t>
+            </w:r>
+            <w:r>
+              <w:t xml:space="preserve"> fix.md </w:t>
+            </w:r>
+            <w:r>
+              <w:t>完成账号生命周期、审计归档、涉密转线下处理和导入错误报告等</w:t>
+            </w:r>
+            <w:r>
+              <w:t xml:space="preserve"> v1.5 </w:t>
+            </w:r>
+            <w:r>
+              <w:t>修订。</w:t>
             </w:r>
           </w:p>
         </w:tc>
@@ -522,7 +509,7 @@
           </w:tcPr>
           <w:p>
             <w:r>
-              <w:t>V1.1</w:t>
+              <w:t>V1.5</w:t>
             </w:r>
           </w:p>
         </w:tc>
@@ -541,32 +528,6 @@
             <w:pPr>
               <w:pStyle w:val="11"/>
             </w:pPr>
-            <w:r>
-              <w:t>3</w:t>
-            </w:r>
-          </w:p>
-        </w:tc>
-        <w:tc>
-          <w:tcPr>
-            <w:tcW w:w="1281" w:type="dxa"/>
-            <w:vAlign w:val="center"/>
-          </w:tcPr>
-          <w:p>
-            <w:pPr>
-              <w:pStyle w:val="11"/>
-              <w:rPr>
-                <w:rFonts w:hint="eastAsia"/>
-              </w:rPr>
-            </w:pPr>
-            <w:r>
-              <w:t>2026-04-</w:t>
-            </w:r>
-            <w:r>
-              <w:rPr>
-                <w:rFonts w:hint="eastAsia"/>
-              </w:rPr>
-              <w:t>06</w:t>
-            </w:r>
           </w:p>
         </w:tc>
         <w:tc>
@@ -578,37 +539,39 @@
             <w:pPr>
               <w:pStyle w:val="11"/>
             </w:pPr>
-            <w:r>
-              <w:t>项目组</w:t>
-            </w:r>
-          </w:p>
-        </w:tc>
-        <w:tc>
-          <w:tcPr>
-            <w:tcW w:w="3827" w:type="dxa"/>
+          </w:p>
+        </w:tc>
+        <w:tc>
+          <w:tcPr>
+            <w:tcW w:w="1281" w:type="dxa"/>
             <w:vAlign w:val="center"/>
           </w:tcPr>
           <w:p>
             <w:pPr>
               <w:pStyle w:val="11"/>
             </w:pPr>
-            <w:r>
-              <w:t>在增强版基础上补全五大模块正文、附录默认审批矩阵和待确认问题，固化一期基线。</w:t>
-            </w:r>
-          </w:p>
-        </w:tc>
-        <w:tc>
-          <w:tcPr>
-            <w:tcW w:w="1192" w:type="dxa"/>
+          </w:p>
+        </w:tc>
+        <w:tc>
+          <w:tcPr>
+            <w:tcW w:w="3827" w:type="dxa"/>
             <w:vAlign w:val="center"/>
           </w:tcPr>
           <w:p>
             <w:pPr>
               <w:pStyle w:val="11"/>
             </w:pPr>
-            <w:r>
-              <w:t>V1.2</w:t>
-            </w:r>
+          </w:p>
+        </w:tc>
+        <w:tc>
+          <w:tcPr>
+            <w:tcW w:w="1192" w:type="dxa"/>
+            <w:vAlign w:val="center"/>
+          </w:tcPr>
+          <w:p>
+            <w:pPr>
+              <w:pStyle w:val="11"/>
+            </w:pPr>
           </w:p>
         </w:tc>
       </w:tr>
@@ -626,32 +589,6 @@
             <w:pPr>
               <w:pStyle w:val="11"/>
             </w:pPr>
-            <w:r>
-              <w:t>4</w:t>
-            </w:r>
-          </w:p>
-        </w:tc>
-        <w:tc>
-          <w:tcPr>
-            <w:tcW w:w="1281" w:type="dxa"/>
-            <w:vAlign w:val="center"/>
-          </w:tcPr>
-          <w:p>
-            <w:pPr>
-              <w:pStyle w:val="11"/>
-              <w:rPr>
-                <w:rFonts w:hint="eastAsia"/>
-              </w:rPr>
-            </w:pPr>
-            <w:r>
-              <w:t>2026-04-1</w:t>
-            </w:r>
-            <w:r>
-              <w:rPr>
-                <w:rFonts w:hint="eastAsia"/>
-              </w:rPr>
-              <w:t>0</w:t>
-            </w:r>
           </w:p>
         </w:tc>
         <w:tc>
@@ -663,37 +600,39 @@
             <w:pPr>
               <w:pStyle w:val="11"/>
             </w:pPr>
-            <w:r>
-              <w:t>项目组</w:t>
-            </w:r>
-          </w:p>
-        </w:tc>
-        <w:tc>
-          <w:tcPr>
-            <w:tcW w:w="3827" w:type="dxa"/>
+          </w:p>
+        </w:tc>
+        <w:tc>
+          <w:tcPr>
+            <w:tcW w:w="1281" w:type="dxa"/>
             <w:vAlign w:val="center"/>
           </w:tcPr>
           <w:p>
             <w:pPr>
               <w:pStyle w:val="11"/>
             </w:pPr>
-            <w:r>
-              <w:t>补充五大核心模块的分析模型、用例图和动态时序图，完善知识问答、党团流程、通知推送、电子证明审批和学业分析场景。</w:t>
-            </w:r>
-          </w:p>
-        </w:tc>
-        <w:tc>
-          <w:tcPr>
-            <w:tcW w:w="1192" w:type="dxa"/>
+          </w:p>
+        </w:tc>
+        <w:tc>
+          <w:tcPr>
+            <w:tcW w:w="3827" w:type="dxa"/>
             <w:vAlign w:val="center"/>
           </w:tcPr>
           <w:p>
             <w:pPr>
               <w:pStyle w:val="11"/>
             </w:pPr>
-            <w:r>
-              <w:t>V1.3</w:t>
-            </w:r>
+          </w:p>
+        </w:tc>
+        <w:tc>
+          <w:tcPr>
+            <w:tcW w:w="1192" w:type="dxa"/>
+            <w:vAlign w:val="center"/>
+          </w:tcPr>
+          <w:p>
+            <w:pPr>
+              <w:pStyle w:val="11"/>
+            </w:pPr>
           </w:p>
         </w:tc>
       </w:tr>
@@ -711,32 +650,6 @@
             <w:pPr>
               <w:pStyle w:val="11"/>
             </w:pPr>
-            <w:r>
-              <w:t>5</w:t>
-            </w:r>
-          </w:p>
-        </w:tc>
-        <w:tc>
-          <w:tcPr>
-            <w:tcW w:w="1281" w:type="dxa"/>
-            <w:vAlign w:val="center"/>
-          </w:tcPr>
-          <w:p>
-            <w:pPr>
-              <w:pStyle w:val="11"/>
-              <w:rPr>
-                <w:rFonts w:hint="eastAsia"/>
-              </w:rPr>
-            </w:pPr>
-            <w:r>
-              <w:t>2026-04-1</w:t>
-            </w:r>
-            <w:r>
-              <w:rPr>
-                <w:rFonts w:hint="eastAsia"/>
-              </w:rPr>
-              <w:t>3</w:t>
-            </w:r>
           </w:p>
         </w:tc>
         <w:tc>
@@ -748,37 +661,39 @@
             <w:pPr>
               <w:pStyle w:val="11"/>
             </w:pPr>
-            <w:r>
-              <w:t>项目组</w:t>
-            </w:r>
-          </w:p>
-        </w:tc>
-        <w:tc>
-          <w:tcPr>
-            <w:tcW w:w="3827" w:type="dxa"/>
+          </w:p>
+        </w:tc>
+        <w:tc>
+          <w:tcPr>
+            <w:tcW w:w="1281" w:type="dxa"/>
             <w:vAlign w:val="center"/>
           </w:tcPr>
           <w:p>
             <w:pPr>
               <w:pStyle w:val="11"/>
             </w:pPr>
-            <w:r>
-              <w:t>扩展奖励荣誉展示和学生画像与信息管理两大模块，整体覆盖七个模块并新增对应 FR、用例和原型。</w:t>
-            </w:r>
-          </w:p>
-        </w:tc>
-        <w:tc>
-          <w:tcPr>
-            <w:tcW w:w="1192" w:type="dxa"/>
+          </w:p>
+        </w:tc>
+        <w:tc>
+          <w:tcPr>
+            <w:tcW w:w="3827" w:type="dxa"/>
             <w:vAlign w:val="center"/>
           </w:tcPr>
           <w:p>
             <w:pPr>
               <w:pStyle w:val="11"/>
             </w:pPr>
-            <w:r>
-              <w:t>V1.4</w:t>
-            </w:r>
+          </w:p>
+        </w:tc>
+        <w:tc>
+          <w:tcPr>
+            <w:tcW w:w="1192" w:type="dxa"/>
+            <w:vAlign w:val="center"/>
+          </w:tcPr>
+          <w:p>
+            <w:pPr>
+              <w:pStyle w:val="11"/>
+            </w:pPr>
           </w:p>
         </w:tc>
       </w:tr>
@@ -796,9 +711,6 @@
             <w:pPr>
               <w:pStyle w:val="11"/>
             </w:pPr>
-            <w:r>
-              <w:t>6</w:t>
-            </w:r>
           </w:p>
         </w:tc>
         <w:tc>
@@ -810,9 +722,6 @@
             <w:pPr>
               <w:pStyle w:val="11"/>
             </w:pPr>
-            <w:r>
-              <w:t>2026-04-15</w:t>
-            </w:r>
           </w:p>
         </w:tc>
         <w:tc>
@@ -824,9 +733,6 @@
             <w:pPr>
               <w:pStyle w:val="11"/>
             </w:pPr>
-            <w:r>
-              <w:t>项目组</w:t>
-            </w:r>
           </w:p>
         </w:tc>
         <w:tc>
@@ -838,9 +744,6 @@
             <w:pPr>
               <w:pStyle w:val="11"/>
             </w:pPr>
-            <w:r>
-              <w:t>完成账号生命周期、审计归档、涉密转线下处理和导入错误报告等 v1.5 修订。</w:t>
-            </w:r>
           </w:p>
         </w:tc>
         <w:tc>
@@ -852,9 +755,6 @@
             <w:pPr>
               <w:pStyle w:val="11"/>
             </w:pPr>
-            <w:r>
-              <w:t>V1.5</w:t>
-            </w:r>
           </w:p>
         </w:tc>
       </w:tr>
@@ -1976,7 +1876,7 @@
             <w:noProof/>
             <w:webHidden/>
           </w:rPr>
-          <w:t>5</w:t>
+          <w:t>4</w:t>
         </w:r>
         <w:r>
           <w:rPr>
@@ -2056,7 +1956,7 @@
             <w:noProof/>
             <w:webHidden/>
           </w:rPr>
-          <w:t>5</w:t>
+          <w:t>4</w:t>
         </w:r>
         <w:r>
           <w:rPr>
@@ -2136,7 +2036,7 @@
             <w:noProof/>
             <w:webHidden/>
           </w:rPr>
-          <w:t>5</w:t>
+          <w:t>4</w:t>
         </w:r>
         <w:r>
           <w:rPr>
@@ -2216,7 +2116,7 @@
             <w:noProof/>
             <w:webHidden/>
           </w:rPr>
-          <w:t>5</w:t>
+          <w:t>4</w:t>
         </w:r>
         <w:r>
           <w:rPr>
@@ -2296,7 +2196,7 @@
             <w:noProof/>
             <w:webHidden/>
           </w:rPr>
-          <w:t>5</w:t>
+          <w:t>4</w:t>
         </w:r>
         <w:r>
           <w:rPr>
@@ -2376,7 +2276,7 @@
             <w:noProof/>
             <w:webHidden/>
           </w:rPr>
-          <w:t>5</w:t>
+          <w:t>4</w:t>
         </w:r>
         <w:r>
           <w:rPr>
@@ -2456,7 +2356,7 @@
             <w:noProof/>
             <w:webHidden/>
           </w:rPr>
-          <w:t>6</w:t>
+          <w:t>5</w:t>
         </w:r>
         <w:r>
           <w:rPr>
@@ -2528,7 +2428,7 @@
             <w:noProof/>
             <w:webHidden/>
           </w:rPr>
-          <w:t>6</w:t>
+          <w:t>5</w:t>
         </w:r>
         <w:r>
           <w:rPr>
@@ -2608,7 +2508,7 @@
             <w:noProof/>
             <w:webHidden/>
           </w:rPr>
-          <w:t>6</w:t>
+          <w:t>5</w:t>
         </w:r>
         <w:r>
           <w:rPr>
@@ -2688,7 +2588,7 @@
             <w:noProof/>
             <w:webHidden/>
           </w:rPr>
-          <w:t>7</w:t>
+          <w:t>6</w:t>
         </w:r>
         <w:r>
           <w:rPr>
@@ -2768,7 +2668,7 @@
             <w:noProof/>
             <w:webHidden/>
           </w:rPr>
-          <w:t>8</w:t>
+          <w:t>7</w:t>
         </w:r>
         <w:r>
           <w:rPr>
@@ -2840,7 +2740,7 @@
             <w:noProof/>
             <w:webHidden/>
           </w:rPr>
-          <w:t>9</w:t>
+          <w:t>7</w:t>
         </w:r>
         <w:r>
           <w:rPr>
@@ -2920,7 +2820,7 @@
             <w:noProof/>
             <w:webHidden/>
           </w:rPr>
-          <w:t>9</w:t>
+          <w:t>7</w:t>
         </w:r>
         <w:r>
           <w:rPr>
@@ -3000,7 +2900,7 @@
             <w:noProof/>
             <w:webHidden/>
           </w:rPr>
-          <w:t>13</w:t>
+          <w:t>12</w:t>
         </w:r>
         <w:r>
           <w:rPr>
@@ -3080,7 +2980,7 @@
             <w:noProof/>
             <w:webHidden/>
           </w:rPr>
-          <w:t>22</w:t>
+          <w:t>20</w:t>
         </w:r>
         <w:r>
           <w:rPr>
@@ -3152,7 +3052,7 @@
             <w:noProof/>
             <w:webHidden/>
           </w:rPr>
-          <w:t>31</w:t>
+          <w:t>30</w:t>
         </w:r>
         <w:r>
           <w:rPr>
@@ -3232,7 +3132,7 @@
             <w:noProof/>
             <w:webHidden/>
           </w:rPr>
-          <w:t>31</w:t>
+          <w:t>30</w:t>
         </w:r>
         <w:r>
           <w:rPr>
@@ -3312,7 +3212,7 @@
             <w:noProof/>
             <w:webHidden/>
           </w:rPr>
-          <w:t>32</w:t>
+          <w:t>31</w:t>
         </w:r>
         <w:r>
           <w:rPr>
@@ -3392,7 +3292,7 @@
             <w:noProof/>
             <w:webHidden/>
           </w:rPr>
-          <w:t>32</w:t>
+          <w:t>31</w:t>
         </w:r>
         <w:r>
           <w:rPr>
@@ -3472,7 +3372,7 @@
             <w:noProof/>
             <w:webHidden/>
           </w:rPr>
-          <w:t>33</w:t>
+          <w:t>32</w:t>
         </w:r>
         <w:r>
           <w:rPr>
@@ -3552,7 +3452,7 @@
             <w:noProof/>
             <w:webHidden/>
           </w:rPr>
-          <w:t>33</w:t>
+          <w:t>32</w:t>
         </w:r>
         <w:r>
           <w:rPr>
@@ -3632,7 +3532,7 @@
             <w:noProof/>
             <w:webHidden/>
           </w:rPr>
-          <w:t>34</w:t>
+          <w:t>33</w:t>
         </w:r>
         <w:r>
           <w:rPr>
@@ -3704,7 +3604,7 @@
             <w:noProof/>
             <w:webHidden/>
           </w:rPr>
-          <w:t>35</w:t>
+          <w:t>33</w:t>
         </w:r>
         <w:r>
           <w:rPr>
@@ -3782,7 +3682,7 @@
             <w:noProof/>
             <w:webHidden/>
           </w:rPr>
-          <w:t>35</w:t>
+          <w:t>34</w:t>
         </w:r>
         <w:r>
           <w:rPr>
@@ -3860,7 +3760,7 @@
             <w:noProof/>
             <w:webHidden/>
           </w:rPr>
-          <w:t>35</w:t>
+          <w:t>34</w:t>
         </w:r>
         <w:r>
           <w:rPr>
@@ -3938,7 +3838,7 @@
             <w:noProof/>
             <w:webHidden/>
           </w:rPr>
-          <w:t>35</w:t>
+          <w:t>34</w:t>
         </w:r>
         <w:r>
           <w:rPr>
@@ -4016,7 +3916,7 @@
             <w:noProof/>
             <w:webHidden/>
           </w:rPr>
-          <w:t>36</w:t>
+          <w:t>34</w:t>
         </w:r>
         <w:r>
           <w:rPr>
@@ -4094,7 +3994,7 @@
             <w:noProof/>
             <w:webHidden/>
           </w:rPr>
-          <w:t>36</w:t>
+          <w:t>35</w:t>
         </w:r>
         <w:r>
           <w:rPr>
@@ -4172,7 +4072,7 @@
             <w:noProof/>
             <w:webHidden/>
           </w:rPr>
-          <w:t>36</w:t>
+          <w:t>35</w:t>
         </w:r>
         <w:r>
           <w:rPr>
@@ -4250,7 +4150,7 @@
             <w:noProof/>
             <w:webHidden/>
           </w:rPr>
-          <w:t>36</w:t>
+          <w:t>35</w:t>
         </w:r>
         <w:r>
           <w:rPr>
@@ -4736,8 +4636,8 @@
         <w:tblLook w:val="04A0" w:firstRow="1" w:lastRow="0" w:firstColumn="1" w:lastColumn="0" w:noHBand="0" w:noVBand="1"/>
       </w:tblPr>
       <w:tblGrid>
-        <w:gridCol w:w="4151"/>
-        <w:gridCol w:w="4151"/>
+        <w:gridCol w:w="4156"/>
+        <w:gridCol w:w="4156"/>
       </w:tblGrid>
       <w:tr>
         <w:trPr>
@@ -4781,23 +4681,18 @@
           </w:tcPr>
           <w:p>
             <w:r>
-              <w:t>软件需求规格说明书，是项目需求、边界、</w:t>
-            </w:r>
-            <w:r>
-              <w:lastRenderedPageBreak/>
-              <w:t>约束和验收依据的正式文档。</w:t>
-            </w:r>
-          </w:p>
-        </w:tc>
-      </w:tr>
-      <w:tr>
-        <w:tc>
-          <w:tcPr>
-            <w:tcW w:w="4156" w:type="dxa"/>
-          </w:tcPr>
-          <w:p>
-            <w:r>
-              <w:lastRenderedPageBreak/>
+              <w:t>软件需求规格说明书，是项目需求、边界、约束和验收依据的正式文档。</w:t>
+            </w:r>
+          </w:p>
+        </w:tc>
+      </w:tr>
+      <w:tr>
+        <w:tc>
+          <w:tcPr>
+            <w:tcW w:w="4156" w:type="dxa"/>
+          </w:tcPr>
+          <w:p>
+            <w:r>
               <w:t>CP</w:t>
             </w:r>
           </w:p>
@@ -5161,8 +5056,8 @@
         <w:tblLook w:val="04A0" w:firstRow="1" w:lastRow="0" w:firstColumn="1" w:lastColumn="0" w:noHBand="0" w:noVBand="1"/>
       </w:tblPr>
       <w:tblGrid>
-        <w:gridCol w:w="4151"/>
-        <w:gridCol w:w="4151"/>
+        <w:gridCol w:w="4156"/>
+        <w:gridCol w:w="4156"/>
       </w:tblGrid>
       <w:tr>
         <w:trPr>
@@ -5246,23 +5141,18 @@
           </w:tcPr>
           <w:p>
             <w:r>
-              <w:t>在组织范围内参与流程推进、节点处理、信</w:t>
-            </w:r>
-            <w:r>
-              <w:lastRenderedPageBreak/>
-              <w:t>息协同和部分业务辅助。</w:t>
-            </w:r>
-          </w:p>
-        </w:tc>
-      </w:tr>
-      <w:tr>
-        <w:tc>
-          <w:tcPr>
-            <w:tcW w:w="4156" w:type="dxa"/>
-          </w:tcPr>
-          <w:p>
-            <w:r>
-              <w:lastRenderedPageBreak/>
+              <w:t>在组织范围内参与流程推进、节点处理、信息协同和部分业务辅助。</w:t>
+            </w:r>
+          </w:p>
+        </w:tc>
+      </w:tr>
+      <w:tr>
+        <w:tc>
+          <w:tcPr>
+            <w:tcW w:w="4156" w:type="dxa"/>
+          </w:tcPr>
+          <w:p>
+            <w:r>
               <w:t>班主任</w:t>
             </w:r>
             <w:r>
@@ -5447,10 +5337,10 @@
           <w:noProof/>
         </w:rPr>
         <w:drawing>
-          <wp:inline distT="0" distB="0" distL="0" distR="0" wp14:anchorId="7FC7D2D6" wp14:editId="00B15587">
+          <wp:inline distT="0" distB="0" distL="0" distR="0" wp14:anchorId="0D688BD6" wp14:editId="689EB1BE">
             <wp:extent cx="5120640" cy="2148180"/>
             <wp:effectExtent l="0" t="0" r="3810" b="5080"/>
-            <wp:docPr id="1" name="图片 1"/>
+            <wp:docPr id="6" name="图片 6"/>
             <wp:cNvGraphicFramePr>
               <a:graphicFrameLocks xmlns:a="http://schemas.openxmlformats.org/drawingml/2006/main" noChangeAspect="1"/>
             </wp:cNvGraphicFramePr>
@@ -5458,7 +5348,7 @@
               <a:graphicData uri="http://schemas.openxmlformats.org/drawingml/2006/picture">
                 <pic:pic xmlns:pic="http://schemas.openxmlformats.org/drawingml/2006/picture">
                   <pic:nvPicPr>
-                    <pic:cNvPr id="1" name=""/>
+                    <pic:cNvPr id="6" name=""/>
                     <pic:cNvPicPr/>
                   </pic:nvPicPr>
                   <pic:blipFill>
@@ -5606,8 +5496,8 @@
         <w:tblLook w:val="04A0" w:firstRow="1" w:lastRow="0" w:firstColumn="1" w:lastColumn="0" w:noHBand="0" w:noVBand="1"/>
       </w:tblPr>
       <w:tblGrid>
-        <w:gridCol w:w="4150"/>
-        <w:gridCol w:w="4152"/>
+        <w:gridCol w:w="4156"/>
+        <w:gridCol w:w="4156"/>
       </w:tblGrid>
       <w:tr>
         <w:trPr>
@@ -5743,7 +5633,6 @@
           </w:tcPr>
           <w:p>
             <w:r>
-              <w:lastRenderedPageBreak/>
               <w:t>范围约束</w:t>
             </w:r>
           </w:p>
@@ -6068,7 +5957,6 @@
           <w:b/>
           <w:bCs w:val="0"/>
         </w:rPr>
-        <w:lastRenderedPageBreak/>
         <w:t>3. 软件功能需求描述</w:t>
       </w:r>
       <w:bookmarkEnd w:id="40"/>
@@ -6362,7 +6250,6 @@
         <w:rPr>
           <w:b/>
         </w:rPr>
-        <w:lastRenderedPageBreak/>
         <w:t>模块五：学业情况分析与预警</w:t>
       </w:r>
     </w:p>
@@ -6539,7 +6426,6 @@
         <w:keepLines/>
       </w:pPr>
       <w:r>
-        <w:lastRenderedPageBreak/>
         <w:t>知识来源、通知来源、模板资产、流程配置和规则配置的后台维护能力。</w:t>
       </w:r>
     </w:p>
@@ -6558,11 +6444,11 @@
         <w:tblLook w:val="04A0" w:firstRow="1" w:lastRow="0" w:firstColumn="1" w:lastColumn="0" w:noHBand="0" w:noVBand="1"/>
       </w:tblPr>
       <w:tblGrid>
-        <w:gridCol w:w="1660"/>
-        <w:gridCol w:w="1660"/>
-        <w:gridCol w:w="1660"/>
-        <w:gridCol w:w="1661"/>
-        <w:gridCol w:w="1661"/>
+        <w:gridCol w:w="1662"/>
+        <w:gridCol w:w="1662"/>
+        <w:gridCol w:w="1662"/>
+        <w:gridCol w:w="1662"/>
+        <w:gridCol w:w="1662"/>
       </w:tblGrid>
       <w:tr>
         <w:trPr>
@@ -7071,10 +6957,10 @@
         <w:tblLook w:val="04A0" w:firstRow="1" w:lastRow="0" w:firstColumn="1" w:lastColumn="0" w:noHBand="0" w:noVBand="1"/>
       </w:tblPr>
       <w:tblGrid>
-        <w:gridCol w:w="2075"/>
-        <w:gridCol w:w="2076"/>
-        <w:gridCol w:w="2075"/>
-        <w:gridCol w:w="2076"/>
+        <w:gridCol w:w="2078"/>
+        <w:gridCol w:w="2078"/>
+        <w:gridCol w:w="2078"/>
+        <w:gridCol w:w="2078"/>
       </w:tblGrid>
       <w:tr>
         <w:trPr>
@@ -7248,11 +7134,7 @@
           </w:tcPr>
           <w:p>
             <w:r>
-              <w:t>老师可上传、停用、更新知识条目和模板；学生可下载标准</w:t>
-            </w:r>
-            <w:r>
-              <w:lastRenderedPageBreak/>
-              <w:t>模板，系统需保留版本信息。</w:t>
+              <w:t>老师可上传、停用、更新知识条目和模板；学生可下载标准模板，系统需保留版本信息。</w:t>
             </w:r>
           </w:p>
         </w:tc>
@@ -7264,7 +7146,6 @@
           </w:tcPr>
           <w:p>
             <w:r>
-              <w:lastRenderedPageBreak/>
               <w:t>FR-004</w:t>
             </w:r>
           </w:p>
@@ -7721,11 +7602,7 @@
           </w:tcPr>
           <w:p>
             <w:r>
-              <w:t>系统应对比培养方案与成绩结果，展示未修满模块、学分缺口和风险提示，不输</w:t>
-            </w:r>
-            <w:r>
-              <w:lastRenderedPageBreak/>
-              <w:t>出毕业资格结论。</w:t>
+              <w:t>系统应对比培养方案与成绩结果，展示未修满模块、学分缺口和风险提示，不输出毕业资格结论。</w:t>
             </w:r>
           </w:p>
         </w:tc>
@@ -7737,7 +7614,6 @@
           </w:tcPr>
           <w:p>
             <w:r>
-              <w:lastRenderedPageBreak/>
               <w:t>FR-015</w:t>
             </w:r>
           </w:p>
@@ -8010,12 +7886,11 @@
         <w:rPr>
           <w:noProof/>
         </w:rPr>
-        <w:lastRenderedPageBreak/>
         <w:drawing>
-          <wp:inline distT="0" distB="0" distL="0" distR="0" wp14:anchorId="6451C400" wp14:editId="7C033B3B">
+          <wp:inline distT="0" distB="0" distL="0" distR="0" wp14:anchorId="6111D5A5" wp14:editId="62CE79D4">
             <wp:extent cx="5029200" cy="7528069"/>
             <wp:effectExtent l="0" t="0" r="0" b="0"/>
-            <wp:docPr id="2" name="图片 2"/>
+            <wp:docPr id="15" name="图片 15"/>
             <wp:cNvGraphicFramePr>
               <a:graphicFrameLocks xmlns:a="http://schemas.openxmlformats.org/drawingml/2006/main" noChangeAspect="1"/>
             </wp:cNvGraphicFramePr>
@@ -8023,7 +7898,7 @@
               <a:graphicData uri="http://schemas.openxmlformats.org/drawingml/2006/picture">
                 <pic:pic xmlns:pic="http://schemas.openxmlformats.org/drawingml/2006/picture">
                   <pic:nvPicPr>
-                    <pic:cNvPr id="2" name=""/>
+                    <pic:cNvPr id="15" name=""/>
                     <pic:cNvPicPr/>
                   </pic:nvPicPr>
                   <pic:blipFill>
@@ -8073,12 +7948,11 @@
         <w:rPr>
           <w:noProof/>
         </w:rPr>
-        <w:lastRenderedPageBreak/>
         <w:drawing>
-          <wp:inline distT="0" distB="0" distL="0" distR="0" wp14:anchorId="0F862E2A" wp14:editId="0122864D">
+          <wp:inline distT="0" distB="0" distL="0" distR="0" wp14:anchorId="2821A448" wp14:editId="290F3F08">
             <wp:extent cx="5029200" cy="7787721"/>
             <wp:effectExtent l="0" t="0" r="0" b="0"/>
-            <wp:docPr id="3" name="图片 3"/>
+            <wp:docPr id="16" name="图片 16"/>
             <wp:cNvGraphicFramePr>
               <a:graphicFrameLocks xmlns:a="http://schemas.openxmlformats.org/drawingml/2006/main" noChangeAspect="1"/>
             </wp:cNvGraphicFramePr>
@@ -8086,7 +7960,7 @@
               <a:graphicData uri="http://schemas.openxmlformats.org/drawingml/2006/picture">
                 <pic:pic xmlns:pic="http://schemas.openxmlformats.org/drawingml/2006/picture">
                   <pic:nvPicPr>
-                    <pic:cNvPr id="3" name=""/>
+                    <pic:cNvPr id="16" name=""/>
                     <pic:cNvPicPr/>
                   </pic:nvPicPr>
                   <pic:blipFill>
@@ -8142,12 +8016,11 @@
         <w:rPr>
           <w:noProof/>
         </w:rPr>
-        <w:lastRenderedPageBreak/>
         <w:drawing>
-          <wp:inline distT="0" distB="0" distL="0" distR="0" wp14:anchorId="34DEADCE" wp14:editId="2D65DF31">
+          <wp:inline distT="0" distB="0" distL="0" distR="0" wp14:anchorId="451A3A8D" wp14:editId="453C0954">
             <wp:extent cx="5029200" cy="5802458"/>
             <wp:effectExtent l="0" t="0" r="0" b="8255"/>
-            <wp:docPr id="4" name="图片 4"/>
+            <wp:docPr id="17" name="图片 17"/>
             <wp:cNvGraphicFramePr>
               <a:graphicFrameLocks xmlns:a="http://schemas.openxmlformats.org/drawingml/2006/main" noChangeAspect="1"/>
             </wp:cNvGraphicFramePr>
@@ -8155,7 +8028,7 @@
               <a:graphicData uri="http://schemas.openxmlformats.org/drawingml/2006/picture">
                 <pic:pic xmlns:pic="http://schemas.openxmlformats.org/drawingml/2006/picture">
                   <pic:nvPicPr>
-                    <pic:cNvPr id="4" name=""/>
+                    <pic:cNvPr id="17" name=""/>
                     <pic:cNvPicPr/>
                   </pic:nvPicPr>
                   <pic:blipFill>
@@ -8208,10 +8081,10 @@
         <w:tblLook w:val="04A0" w:firstRow="1" w:lastRow="0" w:firstColumn="1" w:lastColumn="0" w:noHBand="0" w:noVBand="1"/>
       </w:tblPr>
       <w:tblGrid>
-        <w:gridCol w:w="2075"/>
-        <w:gridCol w:w="2075"/>
-        <w:gridCol w:w="2076"/>
-        <w:gridCol w:w="2076"/>
+        <w:gridCol w:w="2078"/>
+        <w:gridCol w:w="2078"/>
+        <w:gridCol w:w="2078"/>
+        <w:gridCol w:w="2078"/>
       </w:tblGrid>
       <w:tr>
         <w:trPr>
@@ -8491,11 +8364,7 @@
           </w:tcPr>
           <w:p>
             <w:r>
-              <w:t>浏览荣誉榜单并查</w:t>
-            </w:r>
-            <w:r>
-              <w:lastRenderedPageBreak/>
-              <w:t>看榜样事迹</w:t>
+              <w:t>浏览荣誉榜单并查看榜样事迹</w:t>
             </w:r>
           </w:p>
         </w:tc>
@@ -8505,12 +8374,7 @@
           </w:tcPr>
           <w:p>
             <w:r>
-              <w:lastRenderedPageBreak/>
-              <w:t>学生、辅导员、学院</w:t>
-            </w:r>
-            <w:r>
-              <w:lastRenderedPageBreak/>
-              <w:t>领导、管理员</w:t>
+              <w:t>学生、辅导员、学院领导、管理员</w:t>
             </w:r>
           </w:p>
         </w:tc>
@@ -8520,12 +8384,7 @@
           </w:tcPr>
           <w:p>
             <w:r>
-              <w:lastRenderedPageBreak/>
-              <w:t>荣誉公示、分类筛</w:t>
-            </w:r>
-            <w:r>
-              <w:lastRenderedPageBreak/>
-              <w:t>选、事迹展示、荣誉数据维护</w:t>
+              <w:t>荣誉公示、分类筛选、事迹展示、荣誉数据维护</w:t>
             </w:r>
           </w:p>
         </w:tc>
@@ -8537,7 +8396,6 @@
           </w:tcPr>
           <w:p>
             <w:r>
-              <w:lastRenderedPageBreak/>
               <w:t>模块七</w:t>
             </w:r>
           </w:p>
@@ -8591,8 +8449,8 @@
         <w:tblLook w:val="04A0" w:firstRow="1" w:lastRow="0" w:firstColumn="1" w:lastColumn="0" w:noHBand="0" w:noVBand="1"/>
       </w:tblPr>
       <w:tblGrid>
-        <w:gridCol w:w="4151"/>
-        <w:gridCol w:w="4151"/>
+        <w:gridCol w:w="4156"/>
+        <w:gridCol w:w="4156"/>
       </w:tblGrid>
       <w:tr>
         <w:trPr>
@@ -8782,9 +8640,9 @@
         <w:tblLook w:val="04A0" w:firstRow="1" w:lastRow="0" w:firstColumn="1" w:lastColumn="0" w:noHBand="0" w:noVBand="1"/>
       </w:tblPr>
       <w:tblGrid>
-        <w:gridCol w:w="2767"/>
-        <w:gridCol w:w="2767"/>
-        <w:gridCol w:w="2768"/>
+        <w:gridCol w:w="2771"/>
+        <w:gridCol w:w="2771"/>
+        <w:gridCol w:w="2771"/>
       </w:tblGrid>
       <w:tr>
         <w:trPr>
@@ -9000,9 +8858,9 @@
         <w:tblLook w:val="04A0" w:firstRow="1" w:lastRow="0" w:firstColumn="1" w:lastColumn="0" w:noHBand="0" w:noVBand="1"/>
       </w:tblPr>
       <w:tblGrid>
-        <w:gridCol w:w="2767"/>
-        <w:gridCol w:w="2767"/>
-        <w:gridCol w:w="2768"/>
+        <w:gridCol w:w="2771"/>
+        <w:gridCol w:w="2771"/>
+        <w:gridCol w:w="2771"/>
       </w:tblGrid>
       <w:tr>
         <w:trPr>
@@ -9116,8 +8974,8 @@
         <w:tblLook w:val="04A0" w:firstRow="1" w:lastRow="0" w:firstColumn="1" w:lastColumn="0" w:noHBand="0" w:noVBand="1"/>
       </w:tblPr>
       <w:tblGrid>
-        <w:gridCol w:w="4151"/>
-        <w:gridCol w:w="4151"/>
+        <w:gridCol w:w="4156"/>
+        <w:gridCol w:w="4156"/>
       </w:tblGrid>
       <w:tr>
         <w:trPr>
@@ -9195,7 +9053,6 @@
           </w:tcPr>
           <w:p>
             <w:r>
-              <w:lastRenderedPageBreak/>
               <w:t>次要参与者</w:t>
             </w:r>
           </w:p>
@@ -9302,9 +9159,9 @@
         <w:tblLook w:val="04A0" w:firstRow="1" w:lastRow="0" w:firstColumn="1" w:lastColumn="0" w:noHBand="0" w:noVBand="1"/>
       </w:tblPr>
       <w:tblGrid>
-        <w:gridCol w:w="2767"/>
-        <w:gridCol w:w="2767"/>
-        <w:gridCol w:w="2768"/>
+        <w:gridCol w:w="2771"/>
+        <w:gridCol w:w="2771"/>
+        <w:gridCol w:w="2771"/>
       </w:tblGrid>
       <w:tr>
         <w:trPr>
@@ -9538,9 +9395,9 @@
         <w:tblLook w:val="04A0" w:firstRow="1" w:lastRow="0" w:firstColumn="1" w:lastColumn="0" w:noHBand="0" w:noVBand="1"/>
       </w:tblPr>
       <w:tblGrid>
-        <w:gridCol w:w="2767"/>
-        <w:gridCol w:w="2767"/>
-        <w:gridCol w:w="2768"/>
+        <w:gridCol w:w="2771"/>
+        <w:gridCol w:w="2771"/>
+        <w:gridCol w:w="2771"/>
       </w:tblGrid>
       <w:tr>
         <w:trPr>
@@ -9654,8 +9511,8 @@
         <w:tblLook w:val="04A0" w:firstRow="1" w:lastRow="0" w:firstColumn="1" w:lastColumn="0" w:noHBand="0" w:noVBand="1"/>
       </w:tblPr>
       <w:tblGrid>
-        <w:gridCol w:w="4151"/>
-        <w:gridCol w:w="4151"/>
+        <w:gridCol w:w="4156"/>
+        <w:gridCol w:w="4156"/>
       </w:tblGrid>
       <w:tr>
         <w:trPr>
@@ -9833,9 +9690,9 @@
         <w:tblLook w:val="04A0" w:firstRow="1" w:lastRow="0" w:firstColumn="1" w:lastColumn="0" w:noHBand="0" w:noVBand="1"/>
       </w:tblPr>
       <w:tblGrid>
-        <w:gridCol w:w="2767"/>
-        <w:gridCol w:w="2767"/>
-        <w:gridCol w:w="2768"/>
+        <w:gridCol w:w="2771"/>
+        <w:gridCol w:w="2771"/>
+        <w:gridCol w:w="2771"/>
       </w:tblGrid>
       <w:tr>
         <w:trPr>
@@ -9931,23 +9788,18 @@
           </w:tcPr>
           <w:p>
             <w:r>
-              <w:t>支持添加就业、实习、年级、</w:t>
-            </w:r>
-            <w:r>
-              <w:lastRenderedPageBreak/>
-              <w:t>毕业生等标签。</w:t>
-            </w:r>
-          </w:p>
-        </w:tc>
-      </w:tr>
-      <w:tr>
-        <w:tc>
-          <w:tcPr>
-            <w:tcW w:w="2771" w:type="dxa"/>
-          </w:tcPr>
-          <w:p>
-            <w:r>
-              <w:lastRenderedPageBreak/>
+              <w:t>支持添加就业、实习、年级、毕业生等标签。</w:t>
+            </w:r>
+          </w:p>
+        </w:tc>
+      </w:tr>
+      <w:tr>
+        <w:tc>
+          <w:tcPr>
+            <w:tcW w:w="2771" w:type="dxa"/>
+          </w:tcPr>
+          <w:p>
+            <w:r>
               <w:t>3</w:t>
             </w:r>
           </w:p>
@@ -10056,9 +9908,9 @@
         <w:tblLook w:val="04A0" w:firstRow="1" w:lastRow="0" w:firstColumn="1" w:lastColumn="0" w:noHBand="0" w:noVBand="1"/>
       </w:tblPr>
       <w:tblGrid>
-        <w:gridCol w:w="2767"/>
-        <w:gridCol w:w="2767"/>
-        <w:gridCol w:w="2768"/>
+        <w:gridCol w:w="2771"/>
+        <w:gridCol w:w="2771"/>
+        <w:gridCol w:w="2771"/>
       </w:tblGrid>
       <w:tr>
         <w:trPr>
@@ -10178,8 +10030,8 @@
         <w:tblLook w:val="04A0" w:firstRow="1" w:lastRow="0" w:firstColumn="1" w:lastColumn="0" w:noHBand="0" w:noVBand="1"/>
       </w:tblPr>
       <w:tblGrid>
-        <w:gridCol w:w="4151"/>
-        <w:gridCol w:w="4151"/>
+        <w:gridCol w:w="4156"/>
+        <w:gridCol w:w="4156"/>
       </w:tblGrid>
       <w:tr>
         <w:trPr>
@@ -10375,9 +10227,9 @@
         <w:tblLook w:val="04A0" w:firstRow="1" w:lastRow="0" w:firstColumn="1" w:lastColumn="0" w:noHBand="0" w:noVBand="1"/>
       </w:tblPr>
       <w:tblGrid>
-        <w:gridCol w:w="2767"/>
-        <w:gridCol w:w="2767"/>
-        <w:gridCol w:w="2768"/>
+        <w:gridCol w:w="2771"/>
+        <w:gridCol w:w="2771"/>
+        <w:gridCol w:w="2771"/>
       </w:tblGrid>
       <w:tr>
         <w:trPr>
@@ -10599,9 +10451,9 @@
         <w:tblLook w:val="04A0" w:firstRow="1" w:lastRow="0" w:firstColumn="1" w:lastColumn="0" w:noHBand="0" w:noVBand="1"/>
       </w:tblPr>
       <w:tblGrid>
-        <w:gridCol w:w="2767"/>
-        <w:gridCol w:w="2767"/>
-        <w:gridCol w:w="2768"/>
+        <w:gridCol w:w="2771"/>
+        <w:gridCol w:w="2771"/>
+        <w:gridCol w:w="2771"/>
       </w:tblGrid>
       <w:tr>
         <w:trPr>
@@ -10671,11 +10523,7 @@
               <w:t>“</w:t>
             </w:r>
             <w:r>
-              <w:t>转</w:t>
-            </w:r>
-            <w:r>
-              <w:lastRenderedPageBreak/>
-              <w:t>线下处理</w:t>
+              <w:t>转线下处理</w:t>
             </w:r>
             <w:r>
               <w:t>”</w:t>
@@ -10693,7 +10541,6 @@
           </w:tcPr>
           <w:p>
             <w:r>
-              <w:lastRenderedPageBreak/>
               <w:t>P2</w:t>
             </w:r>
           </w:p>
@@ -10788,8 +10635,8 @@
         <w:tblLook w:val="04A0" w:firstRow="1" w:lastRow="0" w:firstColumn="1" w:lastColumn="0" w:noHBand="0" w:noVBand="1"/>
       </w:tblPr>
       <w:tblGrid>
-        <w:gridCol w:w="4151"/>
-        <w:gridCol w:w="4151"/>
+        <w:gridCol w:w="4156"/>
+        <w:gridCol w:w="4156"/>
       </w:tblGrid>
       <w:tr>
         <w:trPr>
@@ -10973,9 +10820,9 @@
         <w:tblLook w:val="04A0" w:firstRow="1" w:lastRow="0" w:firstColumn="1" w:lastColumn="0" w:noHBand="0" w:noVBand="1"/>
       </w:tblPr>
       <w:tblGrid>
-        <w:gridCol w:w="2767"/>
-        <w:gridCol w:w="2767"/>
-        <w:gridCol w:w="2768"/>
+        <w:gridCol w:w="2771"/>
+        <w:gridCol w:w="2771"/>
+        <w:gridCol w:w="2771"/>
       </w:tblGrid>
       <w:tr>
         <w:trPr>
@@ -11191,9 +11038,9 @@
         <w:tblLook w:val="04A0" w:firstRow="1" w:lastRow="0" w:firstColumn="1" w:lastColumn="0" w:noHBand="0" w:noVBand="1"/>
       </w:tblPr>
       <w:tblGrid>
-        <w:gridCol w:w="2768"/>
-        <w:gridCol w:w="2767"/>
-        <w:gridCol w:w="2767"/>
+        <w:gridCol w:w="2771"/>
+        <w:gridCol w:w="2771"/>
+        <w:gridCol w:w="2771"/>
       </w:tblGrid>
       <w:tr>
         <w:trPr>
@@ -11307,8 +11154,8 @@
         <w:tblLook w:val="04A0" w:firstRow="1" w:lastRow="0" w:firstColumn="1" w:lastColumn="0" w:noHBand="0" w:noVBand="1"/>
       </w:tblPr>
       <w:tblGrid>
-        <w:gridCol w:w="4151"/>
-        <w:gridCol w:w="4151"/>
+        <w:gridCol w:w="4156"/>
+        <w:gridCol w:w="4156"/>
       </w:tblGrid>
       <w:tr>
         <w:trPr>
@@ -11364,7 +11211,6 @@
           </w:tcPr>
           <w:p>
             <w:r>
-              <w:lastRenderedPageBreak/>
               <w:t>主要参与者</w:t>
             </w:r>
           </w:p>
@@ -11487,9 +11333,9 @@
         <w:tblLook w:val="04A0" w:firstRow="1" w:lastRow="0" w:firstColumn="1" w:lastColumn="0" w:noHBand="0" w:noVBand="1"/>
       </w:tblPr>
       <w:tblGrid>
-        <w:gridCol w:w="2767"/>
-        <w:gridCol w:w="2767"/>
-        <w:gridCol w:w="2768"/>
+        <w:gridCol w:w="2771"/>
+        <w:gridCol w:w="2771"/>
+        <w:gridCol w:w="2771"/>
       </w:tblGrid>
       <w:tr>
         <w:trPr>
@@ -11705,9 +11551,9 @@
         <w:tblLook w:val="04A0" w:firstRow="1" w:lastRow="0" w:firstColumn="1" w:lastColumn="0" w:noHBand="0" w:noVBand="1"/>
       </w:tblPr>
       <w:tblGrid>
-        <w:gridCol w:w="2767"/>
-        <w:gridCol w:w="2767"/>
-        <w:gridCol w:w="2768"/>
+        <w:gridCol w:w="2771"/>
+        <w:gridCol w:w="2771"/>
+        <w:gridCol w:w="2771"/>
       </w:tblGrid>
       <w:tr>
         <w:trPr>
@@ -11833,8 +11679,8 @@
         <w:tblLook w:val="04A0" w:firstRow="1" w:lastRow="0" w:firstColumn="1" w:lastColumn="0" w:noHBand="0" w:noVBand="1"/>
       </w:tblPr>
       <w:tblGrid>
-        <w:gridCol w:w="4151"/>
-        <w:gridCol w:w="4151"/>
+        <w:gridCol w:w="4156"/>
+        <w:gridCol w:w="4156"/>
       </w:tblGrid>
       <w:tr>
         <w:trPr>
@@ -12012,9 +11858,9 @@
         <w:tblLook w:val="04A0" w:firstRow="1" w:lastRow="0" w:firstColumn="1" w:lastColumn="0" w:noHBand="0" w:noVBand="1"/>
       </w:tblPr>
       <w:tblGrid>
-        <w:gridCol w:w="2767"/>
-        <w:gridCol w:w="2767"/>
-        <w:gridCol w:w="2768"/>
+        <w:gridCol w:w="2771"/>
+        <w:gridCol w:w="2771"/>
+        <w:gridCol w:w="2771"/>
       </w:tblGrid>
       <w:tr>
         <w:trPr>
@@ -12110,23 +11956,18 @@
           </w:tcPr>
           <w:p>
             <w:r>
-              <w:t>聚合展示学籍静态字段与科</w:t>
-            </w:r>
-            <w:r>
-              <w:lastRenderedPageBreak/>
-              <w:t>研、竞赛、实践等动态字段。</w:t>
-            </w:r>
-          </w:p>
-        </w:tc>
-      </w:tr>
-      <w:tr>
-        <w:tc>
-          <w:tcPr>
-            <w:tcW w:w="2771" w:type="dxa"/>
-          </w:tcPr>
-          <w:p>
-            <w:r>
-              <w:lastRenderedPageBreak/>
+              <w:t>聚合展示学籍静态字段与科研、竞赛、实践等动态字段。</w:t>
+            </w:r>
+          </w:p>
+        </w:tc>
+      </w:tr>
+      <w:tr>
+        <w:tc>
+          <w:tcPr>
+            <w:tcW w:w="2771" w:type="dxa"/>
+          </w:tcPr>
+          <w:p>
+            <w:r>
               <w:t>3</w:t>
             </w:r>
           </w:p>
@@ -12285,9 +12126,9 @@
         <w:tblLook w:val="04A0" w:firstRow="1" w:lastRow="0" w:firstColumn="1" w:lastColumn="0" w:noHBand="0" w:noVBand="1"/>
       </w:tblPr>
       <w:tblGrid>
-        <w:gridCol w:w="2767"/>
-        <w:gridCol w:w="2767"/>
-        <w:gridCol w:w="2768"/>
+        <w:gridCol w:w="2771"/>
+        <w:gridCol w:w="2771"/>
+        <w:gridCol w:w="2771"/>
       </w:tblGrid>
       <w:tr>
         <w:trPr>
@@ -12446,10 +12287,10 @@
           <w:noProof/>
         </w:rPr>
         <w:drawing>
-          <wp:inline distT="0" distB="0" distL="0" distR="0" wp14:anchorId="6ADFC73A" wp14:editId="7A15A734">
+          <wp:inline distT="0" distB="0" distL="0" distR="0" wp14:anchorId="1A4F219B" wp14:editId="07B094B8">
             <wp:extent cx="5029200" cy="2784454"/>
             <wp:effectExtent l="0" t="0" r="0" b="0"/>
-            <wp:docPr id="5" name="图片 5"/>
+            <wp:docPr id="18" name="图片 18"/>
             <wp:cNvGraphicFramePr>
               <a:graphicFrameLocks xmlns:a="http://schemas.openxmlformats.org/drawingml/2006/main" noChangeAspect="1"/>
             </wp:cNvGraphicFramePr>
@@ -12457,7 +12298,7 @@
               <a:graphicData uri="http://schemas.openxmlformats.org/drawingml/2006/picture">
                 <pic:pic xmlns:pic="http://schemas.openxmlformats.org/drawingml/2006/picture">
                   <pic:nvPicPr>
-                    <pic:cNvPr id="5" name=""/>
+                    <pic:cNvPr id="18" name=""/>
                     <pic:cNvPicPr/>
                   </pic:nvPicPr>
                   <pic:blipFill>
@@ -12512,12 +12353,11 @@
         <w:rPr>
           <w:noProof/>
         </w:rPr>
-        <w:lastRenderedPageBreak/>
         <w:drawing>
-          <wp:inline distT="0" distB="0" distL="0" distR="0" wp14:anchorId="380AA227" wp14:editId="7E354E25">
+          <wp:inline distT="0" distB="0" distL="0" distR="0" wp14:anchorId="75064689" wp14:editId="6405C91A">
             <wp:extent cx="5029200" cy="3493576"/>
             <wp:effectExtent l="0" t="0" r="0" b="0"/>
-            <wp:docPr id="7" name="图片 7"/>
+            <wp:docPr id="19" name="图片 19"/>
             <wp:cNvGraphicFramePr>
               <a:graphicFrameLocks xmlns:a="http://schemas.openxmlformats.org/drawingml/2006/main" noChangeAspect="1"/>
             </wp:cNvGraphicFramePr>
@@ -12525,7 +12365,7 @@
               <a:graphicData uri="http://schemas.openxmlformats.org/drawingml/2006/picture">
                 <pic:pic xmlns:pic="http://schemas.openxmlformats.org/drawingml/2006/picture">
                   <pic:nvPicPr>
-                    <pic:cNvPr id="7" name=""/>
+                    <pic:cNvPr id="19" name=""/>
                     <pic:cNvPicPr/>
                   </pic:nvPicPr>
                   <pic:blipFill>
@@ -12580,12 +12420,11 @@
         <w:rPr>
           <w:noProof/>
         </w:rPr>
-        <w:lastRenderedPageBreak/>
         <w:drawing>
-          <wp:inline distT="0" distB="0" distL="0" distR="0" wp14:anchorId="3125FC21" wp14:editId="381484EF">
+          <wp:inline distT="0" distB="0" distL="0" distR="0" wp14:anchorId="1BBA26E9" wp14:editId="7E6C8DCA">
             <wp:extent cx="5074920" cy="3411772"/>
             <wp:effectExtent l="0" t="0" r="0" b="0"/>
-            <wp:docPr id="8" name="图片 8"/>
+            <wp:docPr id="20" name="图片 20"/>
             <wp:cNvGraphicFramePr>
               <a:graphicFrameLocks xmlns:a="http://schemas.openxmlformats.org/drawingml/2006/main" noChangeAspect="1"/>
             </wp:cNvGraphicFramePr>
@@ -12593,7 +12432,7 @@
               <a:graphicData uri="http://schemas.openxmlformats.org/drawingml/2006/picture">
                 <pic:pic xmlns:pic="http://schemas.openxmlformats.org/drawingml/2006/picture">
                   <pic:nvPicPr>
-                    <pic:cNvPr id="8" name=""/>
+                    <pic:cNvPr id="20" name=""/>
                     <pic:cNvPicPr/>
                   </pic:nvPicPr>
                   <pic:blipFill>
@@ -12643,12 +12482,11 @@
         <w:rPr>
           <w:noProof/>
         </w:rPr>
-        <w:lastRenderedPageBreak/>
         <w:drawing>
-          <wp:inline distT="0" distB="0" distL="0" distR="0" wp14:anchorId="691BD24D" wp14:editId="7AEA3C46">
+          <wp:inline distT="0" distB="0" distL="0" distR="0" wp14:anchorId="04ECB2BB" wp14:editId="2E640823">
             <wp:extent cx="4983480" cy="6842692"/>
             <wp:effectExtent l="0" t="0" r="0" b="0"/>
-            <wp:docPr id="9" name="图片 9"/>
+            <wp:docPr id="21" name="图片 21"/>
             <wp:cNvGraphicFramePr>
               <a:graphicFrameLocks xmlns:a="http://schemas.openxmlformats.org/drawingml/2006/main" noChangeAspect="1"/>
             </wp:cNvGraphicFramePr>
@@ -12656,7 +12494,7 @@
               <a:graphicData uri="http://schemas.openxmlformats.org/drawingml/2006/picture">
                 <pic:pic xmlns:pic="http://schemas.openxmlformats.org/drawingml/2006/picture">
                   <pic:nvPicPr>
-                    <pic:cNvPr id="9" name=""/>
+                    <pic:cNvPr id="21" name=""/>
                     <pic:cNvPicPr/>
                   </pic:nvPicPr>
                   <pic:blipFill>
@@ -12706,12 +12544,11 @@
         <w:rPr>
           <w:noProof/>
         </w:rPr>
-        <w:lastRenderedPageBreak/>
         <w:drawing>
-          <wp:inline distT="0" distB="0" distL="0" distR="0" wp14:anchorId="09B3A0C1" wp14:editId="07C50034">
+          <wp:inline distT="0" distB="0" distL="0" distR="0" wp14:anchorId="2BC1F190" wp14:editId="37AF11BE">
             <wp:extent cx="5074920" cy="4295854"/>
             <wp:effectExtent l="0" t="0" r="0" b="9525"/>
-            <wp:docPr id="10" name="图片 10"/>
+            <wp:docPr id="22" name="图片 22"/>
             <wp:cNvGraphicFramePr>
               <a:graphicFrameLocks xmlns:a="http://schemas.openxmlformats.org/drawingml/2006/main" noChangeAspect="1"/>
             </wp:cNvGraphicFramePr>
@@ -12719,7 +12556,7 @@
               <a:graphicData uri="http://schemas.openxmlformats.org/drawingml/2006/picture">
                 <pic:pic xmlns:pic="http://schemas.openxmlformats.org/drawingml/2006/picture">
                   <pic:nvPicPr>
-                    <pic:cNvPr id="10" name=""/>
+                    <pic:cNvPr id="22" name=""/>
                     <pic:cNvPicPr/>
                   </pic:nvPicPr>
                   <pic:blipFill>
@@ -12769,12 +12606,11 @@
         <w:rPr>
           <w:noProof/>
         </w:rPr>
-        <w:lastRenderedPageBreak/>
         <w:drawing>
-          <wp:inline distT="0" distB="0" distL="0" distR="0" wp14:anchorId="6F6E313D" wp14:editId="0B434167">
+          <wp:inline distT="0" distB="0" distL="0" distR="0" wp14:anchorId="6A4DEBDB" wp14:editId="3B4A3A10">
             <wp:extent cx="5074920" cy="6847967"/>
             <wp:effectExtent l="0" t="0" r="0" b="0"/>
-            <wp:docPr id="11" name="图片 11"/>
+            <wp:docPr id="23" name="图片 23"/>
             <wp:cNvGraphicFramePr>
               <a:graphicFrameLocks xmlns:a="http://schemas.openxmlformats.org/drawingml/2006/main" noChangeAspect="1"/>
             </wp:cNvGraphicFramePr>
@@ -12782,7 +12618,7 @@
               <a:graphicData uri="http://schemas.openxmlformats.org/drawingml/2006/picture">
                 <pic:pic xmlns:pic="http://schemas.openxmlformats.org/drawingml/2006/picture">
                   <pic:nvPicPr>
-                    <pic:cNvPr id="11" name=""/>
+                    <pic:cNvPr id="23" name=""/>
                     <pic:cNvPicPr/>
                   </pic:nvPicPr>
                   <pic:blipFill>
@@ -12832,12 +12668,11 @@
         <w:rPr>
           <w:noProof/>
         </w:rPr>
-        <w:lastRenderedPageBreak/>
         <w:drawing>
-          <wp:inline distT="0" distB="0" distL="0" distR="0" wp14:anchorId="6AB8955B" wp14:editId="2838494F">
+          <wp:inline distT="0" distB="0" distL="0" distR="0" wp14:anchorId="4C58BFAD" wp14:editId="73A3408D">
             <wp:extent cx="3657600" cy="7673648"/>
             <wp:effectExtent l="0" t="0" r="0" b="3810"/>
-            <wp:docPr id="12" name="图片 12"/>
+            <wp:docPr id="24" name="图片 24"/>
             <wp:cNvGraphicFramePr>
               <a:graphicFrameLocks xmlns:a="http://schemas.openxmlformats.org/drawingml/2006/main" noChangeAspect="1"/>
             </wp:cNvGraphicFramePr>
@@ -12845,7 +12680,7 @@
               <a:graphicData uri="http://schemas.openxmlformats.org/drawingml/2006/picture">
                 <pic:pic xmlns:pic="http://schemas.openxmlformats.org/drawingml/2006/picture">
                   <pic:nvPicPr>
-                    <pic:cNvPr id="12" name=""/>
+                    <pic:cNvPr id="24" name=""/>
                     <pic:cNvPicPr/>
                   </pic:nvPicPr>
                   <pic:blipFill>
@@ -12900,12 +12735,11 @@
         <w:rPr>
           <w:noProof/>
         </w:rPr>
-        <w:lastRenderedPageBreak/>
         <w:drawing>
-          <wp:inline distT="0" distB="0" distL="0" distR="0" wp14:anchorId="35C2B04F" wp14:editId="767AA10D">
+          <wp:inline distT="0" distB="0" distL="0" distR="0" wp14:anchorId="1936535E" wp14:editId="7B5386BA">
             <wp:extent cx="5074920" cy="5420493"/>
             <wp:effectExtent l="0" t="0" r="0" b="8890"/>
-            <wp:docPr id="13" name="图片 13"/>
+            <wp:docPr id="25" name="图片 25"/>
             <wp:cNvGraphicFramePr>
               <a:graphicFrameLocks xmlns:a="http://schemas.openxmlformats.org/drawingml/2006/main" noChangeAspect="1"/>
             </wp:cNvGraphicFramePr>
@@ -12913,7 +12747,7 @@
               <a:graphicData uri="http://schemas.openxmlformats.org/drawingml/2006/picture">
                 <pic:pic xmlns:pic="http://schemas.openxmlformats.org/drawingml/2006/picture">
                   <pic:nvPicPr>
-                    <pic:cNvPr id="13" name=""/>
+                    <pic:cNvPr id="25" name=""/>
                     <pic:cNvPicPr/>
                   </pic:nvPicPr>
                   <pic:blipFill>
@@ -12968,12 +12802,11 @@
         <w:rPr>
           <w:noProof/>
         </w:rPr>
-        <w:lastRenderedPageBreak/>
         <w:drawing>
-          <wp:inline distT="0" distB="0" distL="0" distR="0" wp14:anchorId="43BC0CD3" wp14:editId="26777917">
+          <wp:inline distT="0" distB="0" distL="0" distR="0" wp14:anchorId="76F1B29D" wp14:editId="1B3D2AE7">
             <wp:extent cx="5074920" cy="4779412"/>
             <wp:effectExtent l="0" t="0" r="0" b="2540"/>
-            <wp:docPr id="14" name="图片 14"/>
+            <wp:docPr id="26" name="图片 26"/>
             <wp:cNvGraphicFramePr>
               <a:graphicFrameLocks xmlns:a="http://schemas.openxmlformats.org/drawingml/2006/main" noChangeAspect="1"/>
             </wp:cNvGraphicFramePr>
@@ -12981,7 +12814,7 @@
               <a:graphicData uri="http://schemas.openxmlformats.org/drawingml/2006/picture">
                 <pic:pic xmlns:pic="http://schemas.openxmlformats.org/drawingml/2006/picture">
                   <pic:nvPicPr>
-                    <pic:cNvPr id="14" name=""/>
+                    <pic:cNvPr id="26" name=""/>
                     <pic:cNvPicPr/>
                   </pic:nvPicPr>
                   <pic:blipFill>
@@ -13039,9 +12872,9 @@
         <w:tblLook w:val="04A0" w:firstRow="1" w:lastRow="0" w:firstColumn="1" w:lastColumn="0" w:noHBand="0" w:noVBand="1"/>
       </w:tblPr>
       <w:tblGrid>
-        <w:gridCol w:w="2765"/>
         <w:gridCol w:w="2771"/>
-        <w:gridCol w:w="2766"/>
+        <w:gridCol w:w="2771"/>
+        <w:gridCol w:w="2771"/>
       </w:tblGrid>
       <w:tr>
         <w:trPr>
@@ -13053,7 +12886,6 @@
           </w:tcPr>
           <w:p>
             <w:r>
-              <w:lastRenderedPageBreak/>
               <w:t>实体类别</w:t>
             </w:r>
           </w:p>
@@ -13511,7 +13343,6 @@
         <w:keepLines/>
       </w:pPr>
       <w:r>
-        <w:lastRenderedPageBreak/>
         <w:t>在</w:t>
       </w:r>
       <w:r>
@@ -13641,8 +13472,8 @@
         <w:tblLook w:val="04A0" w:firstRow="1" w:lastRow="0" w:firstColumn="1" w:lastColumn="0" w:noHBand="0" w:noVBand="1"/>
       </w:tblPr>
       <w:tblGrid>
-        <w:gridCol w:w="4151"/>
-        <w:gridCol w:w="4151"/>
+        <w:gridCol w:w="4156"/>
+        <w:gridCol w:w="4156"/>
       </w:tblGrid>
       <w:tr>
         <w:trPr>
@@ -13972,11 +13803,7 @@
     </w:p>
     <w:p>
       <w:r>
-        <w:t>小程序端总体风格：采用正式稳重的学院风格，主色建议使用深绛红，辅以深蓝灰和浅灰白</w:t>
-      </w:r>
-      <w:r>
-        <w:lastRenderedPageBreak/>
-        <w:t>底色；底部采用</w:t>
+        <w:t>小程序端总体风格：采用正式稳重的学院风格，主色建议使用深绛红，辅以深蓝灰和浅灰白底色；底部采用</w:t>
       </w:r>
       <w:r>
         <w:t>“</w:t>
@@ -14024,10 +13851,10 @@
         <w:tblLook w:val="04A0" w:firstRow="1" w:lastRow="0" w:firstColumn="1" w:lastColumn="0" w:noHBand="0" w:noVBand="1"/>
       </w:tblPr>
       <w:tblGrid>
-        <w:gridCol w:w="2076"/>
-        <w:gridCol w:w="2075"/>
-        <w:gridCol w:w="2075"/>
-        <w:gridCol w:w="2076"/>
+        <w:gridCol w:w="2078"/>
+        <w:gridCol w:w="2078"/>
+        <w:gridCol w:w="2078"/>
+        <w:gridCol w:w="2078"/>
       </w:tblGrid>
       <w:tr>
         <w:trPr>
@@ -14300,9 +14127,9 @@
         <w:tblLook w:val="04A0" w:firstRow="1" w:lastRow="0" w:firstColumn="1" w:lastColumn="0" w:noHBand="0" w:noVBand="1"/>
       </w:tblPr>
       <w:tblGrid>
-        <w:gridCol w:w="2767"/>
-        <w:gridCol w:w="2767"/>
-        <w:gridCol w:w="2768"/>
+        <w:gridCol w:w="2771"/>
+        <w:gridCol w:w="2771"/>
+        <w:gridCol w:w="2771"/>
       </w:tblGrid>
       <w:tr>
         <w:trPr>
@@ -14779,7 +14606,6 @@
     </w:p>
     <w:p>
       <w:r>
-        <w:lastRenderedPageBreak/>
         <w:t>数据库脚本交付：包括</w:t>
       </w:r>
       <w:r>
@@ -15084,7 +14910,6 @@
         <w:keepLines/>
       </w:pPr>
       <w:r>
-        <w:lastRenderedPageBreak/>
         <w:t>若真实业务数据未完全到位，可使用甲方确认的样例数据完成专项能力验收，但不得将原始需求中的功能点从规格或交付中删除。</w:t>
       </w:r>
     </w:p>
@@ -15398,7 +15223,6 @@
         <w:rPr>
           <w:b w:val="0"/>
         </w:rPr>
-        <w:lastRenderedPageBreak/>
         <w:t xml:space="preserve">5.4 </w:t>
       </w:r>
       <w:r>
@@ -15746,7 +15570,6 @@
         <w:keepLines/>
       </w:pPr>
       <w:r>
-        <w:lastRenderedPageBreak/>
         <w:t>敏感字段（如家庭联系方式、身份证号）默认部分脱敏展示，并提供</w:t>
       </w:r>
       <w:r>

</xml_diff>